<commit_message>
chore(analysis-e3): Some changes in rmd file, can't much
df_pl_example is for example to upload in chatgpt; R code has changed.

Refs #1
</commit_message>
<xml_diff>
--- a/design3-/Result-n200_corr.docx
+++ b/design3-/Result-n200_corr.docx
@@ -90,6 +90,92 @@
       </w:pPr>
       <w:r>
         <w:rPr/>
+        <w:t>(next page)</w:t>
+      </w:r>
+      <w:r>
+        <w:br w:type="page"/>
+      </w:r>
+    </w:p>
+    <w:p>
+      <w:pPr>
+        <w:pStyle w:val="Normal"/>
+        <w:bidi w:val="0"/>
+        <w:jc w:val="left"/>
+        <w:rPr/>
+      </w:pPr>
+      <w:r>
+        <w:rPr/>
+        <w:t>Final Test by 2 orders (row1=Final order; row2=Initial Order)</w:t>
+      </w:r>
+    </w:p>
+    <w:p>
+      <w:pPr>
+        <w:pStyle w:val="Normal"/>
+        <w:bidi w:val="0"/>
+        <w:jc w:val="left"/>
+        <w:rPr/>
+      </w:pPr>
+      <w:r>
+        <w:rPr/>
+        <w:drawing>
+          <wp:anchor behindDoc="0" distT="0" distB="0" distL="0" distR="0" simplePos="0" locked="0" layoutInCell="0" allowOverlap="1" relativeHeight="5">
+            <wp:simplePos x="0" y="0"/>
+            <wp:positionH relativeFrom="column">
+              <wp:align>center</wp:align>
+            </wp:positionH>
+            <wp:positionV relativeFrom="paragraph">
+              <wp:posOffset>635</wp:posOffset>
+            </wp:positionV>
+            <wp:extent cx="7052310" cy="3776980"/>
+            <wp:effectExtent l="0" t="0" r="0" b="0"/>
+            <wp:wrapSquare wrapText="largest"/>
+            <wp:docPr id="2" name="Image4" descr=""/>
+            <wp:cNvGraphicFramePr>
+              <a:graphicFrameLocks xmlns:a="http://schemas.openxmlformats.org/drawingml/2006/main" noChangeAspect="1"/>
+            </wp:cNvGraphicFramePr>
+            <a:graphic xmlns:a="http://schemas.openxmlformats.org/drawingml/2006/main">
+              <a:graphicData uri="http://schemas.openxmlformats.org/drawingml/2006/picture">
+                <pic:pic xmlns:pic="http://schemas.openxmlformats.org/drawingml/2006/picture">
+                  <pic:nvPicPr>
+                    <pic:cNvPr id="2" name="Image4" descr=""/>
+                    <pic:cNvPicPr>
+                      <a:picLocks noChangeAspect="1" noChangeArrowheads="1"/>
+                    </pic:cNvPicPr>
+                  </pic:nvPicPr>
+                  <pic:blipFill>
+                    <a:blip r:embed="rId3"/>
+                    <a:stretch>
+                      <a:fillRect/>
+                    </a:stretch>
+                  </pic:blipFill>
+                  <pic:spPr bwMode="auto">
+                    <a:xfrm>
+                      <a:off x="0" y="0"/>
+                      <a:ext cx="7052310" cy="3776980"/>
+                    </a:xfrm>
+                    <a:prstGeom prst="rect">
+                      <a:avLst/>
+                    </a:prstGeom>
+                  </pic:spPr>
+                </pic:pic>
+              </a:graphicData>
+            </a:graphic>
+          </wp:anchor>
+        </w:drawing>
+      </w:r>
+      <w:r>
+        <w:br w:type="page"/>
+      </w:r>
+    </w:p>
+    <w:p>
+      <w:pPr>
+        <w:pStyle w:val="Normal"/>
+        <w:bidi w:val="0"/>
+        <w:jc w:val="left"/>
+        <w:rPr/>
+      </w:pPr>
+      <w:r>
+        <w:rPr/>
         <w:t>2. Final Test Between-List result (by initial test list number)</w:t>
       </w:r>
     </w:p>
@@ -136,7 +222,7 @@
             <wp:extent cx="6332220" cy="3543300"/>
             <wp:effectExtent l="0" t="0" r="0" b="0"/>
             <wp:wrapSquare wrapText="largest"/>
-            <wp:docPr id="2" name="Image2" descr=""/>
+            <wp:docPr id="3" name="Image2" descr=""/>
             <wp:cNvGraphicFramePr>
               <a:graphicFrameLocks xmlns:a="http://schemas.openxmlformats.org/drawingml/2006/main" noChangeAspect="1"/>
             </wp:cNvGraphicFramePr>
@@ -144,13 +230,13 @@
               <a:graphicData uri="http://schemas.openxmlformats.org/drawingml/2006/picture">
                 <pic:pic xmlns:pic="http://schemas.openxmlformats.org/drawingml/2006/picture">
                   <pic:nvPicPr>
-                    <pic:cNvPr id="2" name="Image2" descr=""/>
+                    <pic:cNvPr id="3" name="Image2" descr=""/>
                     <pic:cNvPicPr>
                       <a:picLocks noChangeAspect="1" noChangeArrowheads="1"/>
                     </pic:cNvPicPr>
                   </pic:nvPicPr>
                   <pic:blipFill>
-                    <a:blip r:embed="rId3"/>
+                    <a:blip r:embed="rId4"/>
                     <a:stretch>
                       <a:fillRect/>
                     </a:stretch>
@@ -207,7 +293,7 @@
             <wp:extent cx="6332220" cy="3977005"/>
             <wp:effectExtent l="0" t="0" r="0" b="0"/>
             <wp:wrapSquare wrapText="largest"/>
-            <wp:docPr id="3" name="Image3" descr=""/>
+            <wp:docPr id="4" name="Image3" descr=""/>
             <wp:cNvGraphicFramePr>
               <a:graphicFrameLocks xmlns:a="http://schemas.openxmlformats.org/drawingml/2006/main" noChangeAspect="1"/>
             </wp:cNvGraphicFramePr>
@@ -215,13 +301,13 @@
               <a:graphicData uri="http://schemas.openxmlformats.org/drawingml/2006/picture">
                 <pic:pic xmlns:pic="http://schemas.openxmlformats.org/drawingml/2006/picture">
                   <pic:nvPicPr>
-                    <pic:cNvPr id="3" name="Image3" descr=""/>
+                    <pic:cNvPr id="4" name="Image3" descr=""/>
                     <pic:cNvPicPr>
                       <a:picLocks noChangeAspect="1" noChangeArrowheads="1"/>
                     </pic:cNvPicPr>
                   </pic:nvPicPr>
                   <pic:blipFill>
-                    <a:blip r:embed="rId4"/>
+                    <a:blip r:embed="rId5"/>
                     <a:stretch>
                       <a:fillRect/>
                     </a:stretch>

</xml_diff>